<commit_message>
Dodaj natywny plik MS Access (.accdb) oraz instrukcje no-code dla Knack/Tadabase
- ProServ.accdb: gotowa baza MS Access (format V2016) z 4 tabelami,
  autonumerowanymi kluczami, relacjami z wiezami integralnosci i danymi
  (wygenerowana biblioteka Jackcess; zrodlo w .build/)
- sql/kwerendy_ms_access.sql: 4 kwerendy w dialekcie Access do wklejenia
- sprawozdanie/instrukcja_nocode.md: instrukcja krok po kroku (Knack/Tadabase)
- aktualizacja sprawozdania pod realna platforme no-code i plik .accdb
- usuniecie demonstracyjnego nocode-app/index.html
</commit_message>
<xml_diff>
--- a/sprawozdanie/sprawozdanie.docx
+++ b/sprawozdanie/sprawozdanie.docx
@@ -473,14 +473,14 @@
         <w:rPr>
           <w:i/>
         </w:rPr>
-        <w:t xml:space="preserve">aplikacji no-code. Aby projekt był w pełni </w:t>
+        <w:t xml:space="preserve">aplikacji no-code. Bazę wykonano w MS Access (plik </w:t>
       </w:r>
       <w:r>
         <w:rPr>
           <w:b/>
           <w:i/>
         </w:rPr>
-        <w:t>weryfikowalny i powtarzalny</w:t>
+        <w:t>`ProServ.accdb`</w:t>
       </w:r>
       <w:r>
         <w:rPr>
@@ -497,7 +497,7 @@
         <w:rPr>
           <w:i/>
         </w:rPr>
-        <w:t>strukturę bazy zapisano dodatkowo w postaci skryptów SQL oraz zbudowano z nich</w:t>
+        <w:t>format Access 2016, dołączony do pracy), a warstwę no-code odtworzono w</w:t>
       </w:r>
     </w:p>
     <w:p>
@@ -508,21 +508,20 @@
         <w:rPr>
           <w:i/>
         </w:rPr>
-        <w:t xml:space="preserve">działającą bazę (plik </w:t>
+        <w:t xml:space="preserve">platformie </w:t>
       </w:r>
       <w:r>
         <w:rPr>
-          <w:rFonts w:ascii="Consolas" w:hAnsi="Consolas"/>
+          <w:b/>
           <w:i/>
-          <w:sz w:val="20"/>
         </w:rPr>
-        <w:t>baza_proserv.sqlite</w:t>
+        <w:t>Knack.com</w:t>
       </w:r>
       <w:r>
         <w:rPr>
           <w:i/>
         </w:rPr>
-        <w:t>), a warstwę no-code odtworzono jako</w:t>
+        <w:t>, której procedurę odtworzenia opisano krok po kroku</w:t>
       </w:r>
     </w:p>
     <w:p>
@@ -533,7 +532,7 @@
         <w:rPr>
           <w:i/>
         </w:rPr>
-        <w:t>samodzielną, działającą aplikację webową (</w:t>
+        <w:t xml:space="preserve">w załączniku </w:t>
       </w:r>
       <w:r>
         <w:rPr>
@@ -541,13 +540,13 @@
           <w:i/>
           <w:sz w:val="20"/>
         </w:rPr>
-        <w:t>nocode-app/index.html</w:t>
+        <w:t>instrukcja_nocode.md</w:t>
       </w:r>
       <w:r>
         <w:rPr>
           <w:i/>
         </w:rPr>
-        <w:t>). Składnia</w:t>
+        <w:t>. Dodatkowo strukturę bazy zapisano w</w:t>
       </w:r>
     </w:p>
     <w:p>
@@ -558,7 +557,7 @@
         <w:rPr>
           <w:i/>
         </w:rPr>
-        <w:t>SQL i typy danych zostały dobrane tak, aby odpowiadały rozwiązaniom MS Access –</w:t>
+        <w:t>postaci skryptów SQL, co pozwala odtworzyć i automatycznie zweryfikować całość</w:t>
       </w:r>
     </w:p>
     <w:p>
@@ -569,7 +568,32 @@
         <w:rPr>
           <w:i/>
         </w:rPr>
-        <w:t>mapowanie typów opisano w kroku 1.</w:t>
+        <w:t xml:space="preserve">(skrypt </w:t>
+      </w:r>
+      <w:r>
+        <w:rPr>
+          <w:rFonts w:ascii="Consolas" w:hAnsi="Consolas"/>
+          <w:i/>
+          <w:sz w:val="20"/>
+        </w:rPr>
+        <w:t>build_db.py</w:t>
+      </w:r>
+      <w:r>
+        <w:rPr>
+          <w:i/>
+        </w:rPr>
+        <w:t>). Mapowanie typów danych MS Access ↔ SQL ↔ Knack</w:t>
+      </w:r>
+    </w:p>
+    <w:p>
+      <w:pPr>
+        <w:ind w:left="454"/>
+      </w:pPr>
+      <w:r>
+        <w:rPr>
+          <w:i/>
+        </w:rPr>
+        <w:t>opisano w kolejnych krokach.</w:t>
       </w:r>
     </w:p>
     <w:p>
@@ -7497,12 +7521,12 @@
     </w:p>
     <w:p>
       <w:r>
-        <w:t>Zgodnie z wymaganiem, tę samą strukturę odtworzono w środowisku no-code. Poniżej</w:t>
+        <w:t>Zgodnie z wymaganiem, tę samą strukturę odtworzono w środowisku no-code –</w:t>
       </w:r>
     </w:p>
     <w:p>
       <w:r>
-        <w:t xml:space="preserve">opisano procedurę dla platformy </w:t>
+        <w:t xml:space="preserve">w platformie </w:t>
       </w:r>
       <w:r>
         <w:rPr>
@@ -7511,10 +7535,8 @@
         <w:t>Knack.com</w:t>
       </w:r>
       <w:r>
-        <w:t xml:space="preserve"> (analogicznie postępuje się w</w:t>
+        <w:t xml:space="preserve"> (analogicznie można wykonać w </w:t>
       </w:r>
-    </w:p>
-    <w:p>
       <w:r>
         <w:rPr>
           <w:b/>
@@ -7522,18 +7544,26 @@
         <w:t>Tadabase.io</w:t>
       </w:r>
       <w:r>
-        <w:t xml:space="preserve">), a następnie przedstawiono </w:t>
+        <w:t>).</w:t>
+      </w:r>
+    </w:p>
+    <w:p>
+      <w:r>
+        <w:t>Poniżej opisano procedurę; pełną instrukcję „klik po kliku” wraz z listą</w:t>
+      </w:r>
+    </w:p>
+    <w:p>
+      <w:r>
+        <w:t xml:space="preserve">zrzutów ekranu zawiera załącznik </w:t>
       </w:r>
       <w:r>
         <w:rPr>
           <w:b/>
         </w:rPr>
-        <w:t>działającą aplikację demonstracyjną</w:t>
+        <w:t>`instrukcja_nocode.md`</w:t>
       </w:r>
-    </w:p>
-    <w:p>
       <w:r>
-        <w:t>dołączoną do projektu.</w:t>
+        <w:t>.</w:t>
       </w:r>
     </w:p>
     <w:p>
@@ -8102,26 +8132,512 @@
         <w:pStyle w:val="Heading3"/>
       </w:pPr>
       <w:r>
-        <w:t>6.2. Dołączona działająca aplikacja demonstracyjna</w:t>
+        <w:t>6.2. Odwzorowanie pojęć MS Access w Knack</w:t>
       </w:r>
     </w:p>
     <w:p>
       <w:r>
-        <w:t>Aby projekt był w pełni sprawdzalny bez konta na komercyjnej platformie, do</w:t>
+        <w:t>Kluczem do poprawnego odtworzenia bazy jest świadome odwzorowanie pojęć:</w:t>
+      </w:r>
+    </w:p>
+    <w:tbl>
+      <w:tblPr>
+        <w:tblStyle w:val="TableGrid"/>
+        <w:tblW w:type="auto" w:w="0"/>
+        <w:jc w:val="center"/>
+        <w:tblLook w:firstColumn="1" w:firstRow="1" w:lastColumn="0" w:lastRow="0" w:noHBand="0" w:noVBand="1" w:val="04A0"/>
+      </w:tblPr>
+      <w:tblGrid>
+        <w:gridCol w:w="3135"/>
+        <w:gridCol w:w="3135"/>
+        <w:gridCol w:w="3135"/>
+      </w:tblGrid>
+      <w:tr>
+        <w:tc>
+          <w:tcPr>
+            <w:tcW w:type="dxa" w:w="3135"/>
+            <w:shd w:val="clear" w:fill="D9E2F3"/>
+          </w:tcPr>
+          <w:p>
+            <w:r/>
+            <w:r>
+              <w:rPr>
+                <w:rFonts w:ascii="Times New Roman" w:hAnsi="Times New Roman"/>
+                <w:b/>
+                <w:sz w:val="20"/>
+              </w:rPr>
+              <w:t>MS Access</w:t>
+            </w:r>
+          </w:p>
+        </w:tc>
+        <w:tc>
+          <w:tcPr>
+            <w:tcW w:type="dxa" w:w="3135"/>
+            <w:shd w:val="clear" w:fill="D9E2F3"/>
+          </w:tcPr>
+          <w:p>
+            <w:r/>
+            <w:r>
+              <w:rPr>
+                <w:rFonts w:ascii="Times New Roman" w:hAnsi="Times New Roman"/>
+                <w:b/>
+                <w:sz w:val="20"/>
+              </w:rPr>
+              <w:t>Knack</w:t>
+            </w:r>
+          </w:p>
+        </w:tc>
+        <w:tc>
+          <w:tcPr>
+            <w:tcW w:type="dxa" w:w="3135"/>
+            <w:shd w:val="clear" w:fill="D9E2F3"/>
+          </w:tcPr>
+          <w:p>
+            <w:r/>
+            <w:r>
+              <w:rPr>
+                <w:rFonts w:ascii="Times New Roman" w:hAnsi="Times New Roman"/>
+                <w:b/>
+                <w:sz w:val="20"/>
+              </w:rPr>
+              <w:t>Uwaga</w:t>
+            </w:r>
+          </w:p>
+        </w:tc>
+      </w:tr>
+      <w:tr>
+        <w:tc>
+          <w:tcPr>
+            <w:tcW w:type="dxa" w:w="3135"/>
+          </w:tcPr>
+          <w:p>
+            <w:r>
+              <w:rPr>
+                <w:rFonts w:ascii="Times New Roman" w:hAnsi="Times New Roman"/>
+                <w:sz w:val="20"/>
+              </w:rPr>
+            </w:r>
+            <w:r>
+              <w:rPr>
+                <w:rFonts w:ascii="Times New Roman" w:hAnsi="Times New Roman"/>
+                <w:sz w:val="20"/>
+              </w:rPr>
+              <w:t>Tabela</w:t>
+            </w:r>
+          </w:p>
+        </w:tc>
+        <w:tc>
+          <w:tcPr>
+            <w:tcW w:type="dxa" w:w="3135"/>
+          </w:tcPr>
+          <w:p>
+            <w:r>
+              <w:rPr>
+                <w:rFonts w:ascii="Times New Roman" w:hAnsi="Times New Roman"/>
+                <w:sz w:val="20"/>
+              </w:rPr>
+            </w:r>
+            <w:r>
+              <w:rPr>
+                <w:rFonts w:ascii="Times New Roman" w:hAnsi="Times New Roman"/>
+                <w:sz w:val="20"/>
+              </w:rPr>
+              <w:t>Object (obiekt)</w:t>
+            </w:r>
+          </w:p>
+        </w:tc>
+        <w:tc>
+          <w:tcPr>
+            <w:tcW w:type="dxa" w:w="3135"/>
+          </w:tcPr>
+          <w:p>
+            <w:r>
+              <w:rPr>
+                <w:rFonts w:ascii="Times New Roman" w:hAnsi="Times New Roman"/>
+                <w:sz w:val="20"/>
+              </w:rPr>
+            </w:r>
+            <w:r>
+              <w:rPr>
+                <w:rFonts w:ascii="Times New Roman" w:hAnsi="Times New Roman"/>
+                <w:sz w:val="20"/>
+              </w:rPr>
+              <w:t>jeden obiekt = jedna tabela</w:t>
+            </w:r>
+          </w:p>
+        </w:tc>
+      </w:tr>
+      <w:tr>
+        <w:tc>
+          <w:tcPr>
+            <w:tcW w:type="dxa" w:w="3135"/>
+          </w:tcPr>
+          <w:p>
+            <w:r>
+              <w:rPr>
+                <w:rFonts w:ascii="Times New Roman" w:hAnsi="Times New Roman"/>
+                <w:sz w:val="20"/>
+              </w:rPr>
+            </w:r>
+            <w:r>
+              <w:rPr>
+                <w:rFonts w:ascii="Times New Roman" w:hAnsi="Times New Roman"/>
+                <w:sz w:val="20"/>
+              </w:rPr>
+              <w:t>Pole + typ danych</w:t>
+            </w:r>
+          </w:p>
+        </w:tc>
+        <w:tc>
+          <w:tcPr>
+            <w:tcW w:type="dxa" w:w="3135"/>
+          </w:tcPr>
+          <w:p>
+            <w:r>
+              <w:rPr>
+                <w:rFonts w:ascii="Times New Roman" w:hAnsi="Times New Roman"/>
+                <w:sz w:val="20"/>
+              </w:rPr>
+            </w:r>
+            <w:r>
+              <w:rPr>
+                <w:rFonts w:ascii="Times New Roman" w:hAnsi="Times New Roman"/>
+                <w:sz w:val="20"/>
+              </w:rPr>
+              <w:t>Field + typ pola</w:t>
+            </w:r>
+          </w:p>
+        </w:tc>
+        <w:tc>
+          <w:tcPr>
+            <w:tcW w:type="dxa" w:w="3135"/>
+          </w:tcPr>
+          <w:p>
+            <w:r>
+              <w:rPr>
+                <w:rFonts w:ascii="Times New Roman" w:hAnsi="Times New Roman"/>
+                <w:sz w:val="20"/>
+              </w:rPr>
+            </w:r>
+            <w:r>
+              <w:rPr>
+                <w:rFonts w:ascii="Times New Roman" w:hAnsi="Times New Roman"/>
+                <w:sz w:val="20"/>
+              </w:rPr>
+              <w:t>np. Waluta → Currency</w:t>
+            </w:r>
+          </w:p>
+        </w:tc>
+      </w:tr>
+      <w:tr>
+        <w:tc>
+          <w:tcPr>
+            <w:tcW w:type="dxa" w:w="3135"/>
+          </w:tcPr>
+          <w:p>
+            <w:r>
+              <w:rPr>
+                <w:rFonts w:ascii="Times New Roman" w:hAnsi="Times New Roman"/>
+                <w:sz w:val="20"/>
+              </w:rPr>
+            </w:r>
+            <w:r>
+              <w:rPr>
+                <w:rFonts w:ascii="Times New Roman" w:hAnsi="Times New Roman"/>
+                <w:sz w:val="20"/>
+              </w:rPr>
+              <w:t>Klucz podstawowy (Autonumer)</w:t>
+            </w:r>
+          </w:p>
+        </w:tc>
+        <w:tc>
+          <w:tcPr>
+            <w:tcW w:type="dxa" w:w="3135"/>
+          </w:tcPr>
+          <w:p>
+            <w:r>
+              <w:rPr>
+                <w:rFonts w:ascii="Times New Roman" w:hAnsi="Times New Roman"/>
+                <w:sz w:val="20"/>
+              </w:rPr>
+            </w:r>
+            <w:r>
+              <w:rPr>
+                <w:rFonts w:ascii="Times New Roman" w:hAnsi="Times New Roman"/>
+                <w:sz w:val="20"/>
+              </w:rPr>
+              <w:t>wbudowane pole ID rekordu</w:t>
+            </w:r>
+          </w:p>
+        </w:tc>
+        <w:tc>
+          <w:tcPr>
+            <w:tcW w:type="dxa" w:w="3135"/>
+          </w:tcPr>
+          <w:p>
+            <w:r>
+              <w:rPr>
+                <w:rFonts w:ascii="Times New Roman" w:hAnsi="Times New Roman"/>
+                <w:sz w:val="20"/>
+              </w:rPr>
+            </w:r>
+            <w:r>
+              <w:rPr>
+                <w:rFonts w:ascii="Times New Roman" w:hAnsi="Times New Roman"/>
+                <w:sz w:val="20"/>
+              </w:rPr>
+              <w:t>tworzone automatycznie</w:t>
+            </w:r>
+          </w:p>
+        </w:tc>
+      </w:tr>
+      <w:tr>
+        <w:tc>
+          <w:tcPr>
+            <w:tcW w:type="dxa" w:w="3135"/>
+          </w:tcPr>
+          <w:p>
+            <w:r>
+              <w:rPr>
+                <w:rFonts w:ascii="Times New Roman" w:hAnsi="Times New Roman"/>
+                <w:sz w:val="20"/>
+              </w:rPr>
+            </w:r>
+            <w:r>
+              <w:rPr>
+                <w:rFonts w:ascii="Times New Roman" w:hAnsi="Times New Roman"/>
+                <w:sz w:val="20"/>
+              </w:rPr>
+              <w:t>Klucz obcy + relacja</w:t>
+            </w:r>
+          </w:p>
+        </w:tc>
+        <w:tc>
+          <w:tcPr>
+            <w:tcW w:type="dxa" w:w="3135"/>
+          </w:tcPr>
+          <w:p>
+            <w:r>
+              <w:rPr>
+                <w:rFonts w:ascii="Times New Roman" w:hAnsi="Times New Roman"/>
+                <w:sz w:val="20"/>
+              </w:rPr>
+            </w:r>
+            <w:r>
+              <w:rPr>
+                <w:rFonts w:ascii="Times New Roman" w:hAnsi="Times New Roman"/>
+                <w:sz w:val="20"/>
+              </w:rPr>
+              <w:t xml:space="preserve">pole </w:t>
+            </w:r>
+            <w:r>
+              <w:rPr>
+                <w:rFonts w:ascii="Times New Roman" w:hAnsi="Times New Roman"/>
+                <w:b/>
+                <w:sz w:val="20"/>
+              </w:rPr>
+              <w:t>Connection</w:t>
+            </w:r>
+          </w:p>
+        </w:tc>
+        <w:tc>
+          <w:tcPr>
+            <w:tcW w:type="dxa" w:w="3135"/>
+          </w:tcPr>
+          <w:p>
+            <w:r>
+              <w:rPr>
+                <w:rFonts w:ascii="Times New Roman" w:hAnsi="Times New Roman"/>
+                <w:sz w:val="20"/>
+              </w:rPr>
+            </w:r>
+            <w:r>
+              <w:rPr>
+                <w:rFonts w:ascii="Times New Roman" w:hAnsi="Times New Roman"/>
+                <w:sz w:val="20"/>
+              </w:rPr>
+              <w:t>pilnuje spójności (więzy integralności)</w:t>
+            </w:r>
+          </w:p>
+        </w:tc>
+      </w:tr>
+      <w:tr>
+        <w:tc>
+          <w:tcPr>
+            <w:tcW w:type="dxa" w:w="3135"/>
+          </w:tcPr>
+          <w:p>
+            <w:r>
+              <w:rPr>
+                <w:rFonts w:ascii="Times New Roman" w:hAnsi="Times New Roman"/>
+                <w:sz w:val="20"/>
+              </w:rPr>
+            </w:r>
+            <w:r>
+              <w:rPr>
+                <w:rFonts w:ascii="Times New Roman" w:hAnsi="Times New Roman"/>
+                <w:sz w:val="20"/>
+              </w:rPr>
+              <w:t>Kwerenda złożona (agregacja)</w:t>
+            </w:r>
+          </w:p>
+        </w:tc>
+        <w:tc>
+          <w:tcPr>
+            <w:tcW w:type="dxa" w:w="3135"/>
+          </w:tcPr>
+          <w:p>
+            <w:r>
+              <w:rPr>
+                <w:rFonts w:ascii="Times New Roman" w:hAnsi="Times New Roman"/>
+                <w:sz w:val="20"/>
+              </w:rPr>
+            </w:r>
+            <w:r>
+              <w:rPr>
+                <w:rFonts w:ascii="Times New Roman" w:hAnsi="Times New Roman"/>
+                <w:sz w:val="20"/>
+              </w:rPr>
+              <w:t xml:space="preserve">pole </w:t>
+            </w:r>
+            <w:r>
+              <w:rPr>
+                <w:rFonts w:ascii="Times New Roman" w:hAnsi="Times New Roman"/>
+                <w:b/>
+                <w:sz w:val="20"/>
+              </w:rPr>
+              <w:t>Equation</w:t>
+            </w:r>
+            <w:r>
+              <w:rPr>
+                <w:rFonts w:ascii="Times New Roman" w:hAnsi="Times New Roman"/>
+                <w:sz w:val="20"/>
+              </w:rPr>
+              <w:t xml:space="preserve"> / </w:t>
+            </w:r>
+            <w:r>
+              <w:rPr>
+                <w:rFonts w:ascii="Times New Roman" w:hAnsi="Times New Roman"/>
+                <w:b/>
+                <w:sz w:val="20"/>
+              </w:rPr>
+              <w:t>Sum</w:t>
+            </w:r>
+          </w:p>
+        </w:tc>
+        <w:tc>
+          <w:tcPr>
+            <w:tcW w:type="dxa" w:w="3135"/>
+          </w:tcPr>
+          <w:p>
+            <w:r>
+              <w:rPr>
+                <w:rFonts w:ascii="Times New Roman" w:hAnsi="Times New Roman"/>
+                <w:sz w:val="20"/>
+              </w:rPr>
+            </w:r>
+            <w:r>
+              <w:rPr>
+                <w:rFonts w:ascii="Times New Roman" w:hAnsi="Times New Roman"/>
+                <w:sz w:val="20"/>
+              </w:rPr>
+              <w:t>wartość pozycji i suma zamówienia</w:t>
+            </w:r>
+          </w:p>
+        </w:tc>
+      </w:tr>
+      <w:tr>
+        <w:tc>
+          <w:tcPr>
+            <w:tcW w:type="dxa" w:w="3135"/>
+          </w:tcPr>
+          <w:p>
+            <w:r>
+              <w:rPr>
+                <w:rFonts w:ascii="Times New Roman" w:hAnsi="Times New Roman"/>
+                <w:sz w:val="20"/>
+              </w:rPr>
+            </w:r>
+            <w:r>
+              <w:rPr>
+                <w:rFonts w:ascii="Times New Roman" w:hAnsi="Times New Roman"/>
+                <w:sz w:val="20"/>
+              </w:rPr>
+              <w:t>Indeks bez duplikatów</w:t>
+            </w:r>
+          </w:p>
+        </w:tc>
+        <w:tc>
+          <w:tcPr>
+            <w:tcW w:type="dxa" w:w="3135"/>
+          </w:tcPr>
+          <w:p>
+            <w:r>
+              <w:rPr>
+                <w:rFonts w:ascii="Times New Roman" w:hAnsi="Times New Roman"/>
+                <w:sz w:val="20"/>
+              </w:rPr>
+            </w:r>
+            <w:r>
+              <w:rPr>
+                <w:rFonts w:ascii="Times New Roman" w:hAnsi="Times New Roman"/>
+                <w:sz w:val="20"/>
+              </w:rPr>
+              <w:t xml:space="preserve">opcja </w:t>
+            </w:r>
+            <w:r>
+              <w:rPr>
+                <w:rFonts w:ascii="Times New Roman" w:hAnsi="Times New Roman"/>
+                <w:b/>
+                <w:sz w:val="20"/>
+              </w:rPr>
+              <w:t>Must be unique</w:t>
+            </w:r>
+          </w:p>
+        </w:tc>
+        <w:tc>
+          <w:tcPr>
+            <w:tcW w:type="dxa" w:w="3135"/>
+          </w:tcPr>
+          <w:p>
+            <w:r>
+              <w:rPr>
+                <w:rFonts w:ascii="Times New Roman" w:hAnsi="Times New Roman"/>
+                <w:sz w:val="20"/>
+              </w:rPr>
+            </w:r>
+            <w:r>
+              <w:rPr>
+                <w:rFonts w:ascii="Times New Roman" w:hAnsi="Times New Roman"/>
+                <w:sz w:val="20"/>
+              </w:rPr>
+              <w:t xml:space="preserve">np. pole </w:t>
+            </w:r>
+            <w:r>
+              <w:rPr>
+                <w:rFonts w:ascii="Times New Roman" w:hAnsi="Times New Roman"/>
+                <w:sz w:val="20"/>
+              </w:rPr>
+              <w:t>email</w:t>
+            </w:r>
+          </w:p>
+        </w:tc>
+      </w:tr>
+    </w:tbl>
+    <w:p/>
+    <w:p>
+      <w:r>
+        <w:t>Po wykonaniu tych kroków w Knack istnieją cztery obiekty z identycznym zestawem</w:t>
       </w:r>
     </w:p>
     <w:p>
       <w:r>
-        <w:t xml:space="preserve">sprawozdania dołączono </w:t>
+        <w:t>pól jak w MS Access oraz trzy relacje (Connection) odpowiadające relacjom z bazy</w:t>
       </w:r>
+    </w:p>
+    <w:p>
       <w:r>
-        <w:rPr>
-          <w:b/>
-        </w:rPr>
-        <w:t>samodzielną aplikację webową</w:t>
-      </w:r>
-      <w:r>
-        <w:t xml:space="preserve"> w pliku</w:t>
+        <w:t>Access. Zrzuty ekranu z gotowej aplikacji (rysunki 1–7 wg listy w</w:t>
       </w:r>
     </w:p>
     <w:p>
@@ -8130,80 +8646,10 @@
           <w:rFonts w:ascii="Consolas" w:hAnsi="Consolas"/>
           <w:sz w:val="20"/>
         </w:rPr>
-        <w:t>nocode-app/index.html</w:t>
+        <w:t>instrukcja_nocode.md</w:t>
       </w:r>
       <w:r>
-        <w:t>. Odwzorowuje ona dokładnie tę samą strukturę (cztery</w:t>
-      </w:r>
-    </w:p>
-    <w:p>
-      <w:r>
-        <w:t>„tabele”, te same pola i relacje oparte na identyfikatorach) i działa w</w:t>
-      </w:r>
-    </w:p>
-    <w:p>
-      <w:r>
-        <w:t>przeglądarce bez instalacji – wystarczy otworzyć plik. Dane są przechowywane</w:t>
-      </w:r>
-    </w:p>
-    <w:p>
-      <w:r>
-        <w:t>lokalnie (localStorage), a przycisk „Przywróć dane przykładowe” resetuje bazę do</w:t>
-      </w:r>
-    </w:p>
-    <w:p>
-      <w:r>
-        <w:t>stanu wyjściowego.</w:t>
-      </w:r>
-    </w:p>
-    <w:p>
-      <w:r>
-        <w:t>Aplikacja zawiera:</w:t>
-      </w:r>
-    </w:p>
-    <w:p>
-      <w:pPr>
-        <w:pStyle w:val="ListBullet"/>
-      </w:pPr>
-      <w:r>
-        <w:rPr>
-          <w:b/>
-        </w:rPr>
-        <w:t>Pulpit</w:t>
-      </w:r>
-      <w:r>
-        <w:t xml:space="preserve"> z miarami (liczba klientów, usług, zamówień, przychód) oraz</w:t>
-      </w:r>
-    </w:p>
-    <w:p>
-      <w:r>
-        <w:t xml:space="preserve">  rankingiem usług wg przychodu – odpowiednik kwerend złożonych,</w:t>
-      </w:r>
-    </w:p>
-    <w:p>
-      <w:pPr>
-        <w:pStyle w:val="ListBullet"/>
-      </w:pPr>
-      <w:r>
-        <w:t>widoki listowe czterech tabel z odwzorowaniem relacji (np. w zamówieniach</w:t>
-      </w:r>
-    </w:p>
-    <w:p>
-      <w:r>
-        <w:t xml:space="preserve">  wyświetlana jest nazwa klienta zamiast samego identyfikatora – odpowiednik</w:t>
-      </w:r>
-    </w:p>
-    <w:p>
-      <w:r>
-        <w:t xml:space="preserve">  złączenia JOIN),</w:t>
-      </w:r>
-    </w:p>
-    <w:p>
-      <w:pPr>
-        <w:pStyle w:val="ListBullet"/>
-      </w:pPr>
-      <w:r>
-        <w:t>formularze opisane w kroku 6.</w:t>
+        <w:t>) dokumentują strukturę, relacje, dane i formularze.</w:t>
       </w:r>
     </w:p>
     <w:p>
@@ -8240,12 +8686,27 @@
     </w:p>
     <w:p>
       <w:r>
-        <w:t>oraz *Table/Grid* (przeglądanie). W aplikacji dołączonej do projektu odpowiadają</w:t>
+        <w:t>oraz *Table/Grid* (przeglądanie); szczegółowy sposób ich utworzenia opisano w</w:t>
       </w:r>
     </w:p>
     <w:p>
       <w:r>
-        <w:t>im poniższe funkcje:</w:t>
+        <w:t xml:space="preserve">punkcie E załącznika </w:t>
+      </w:r>
+      <w:r>
+        <w:rPr>
+          <w:rFonts w:ascii="Consolas" w:hAnsi="Consolas"/>
+          <w:sz w:val="20"/>
+        </w:rPr>
+        <w:t>instrukcja_nocode.md</w:t>
+      </w:r>
+      <w:r>
+        <w:t>. Przygotowano następujące formularze</w:t>
+      </w:r>
+    </w:p>
+    <w:p>
+      <w:r>
+        <w:t>i widoki:</w:t>
       </w:r>
     </w:p>
     <w:tbl>
@@ -8859,9 +9320,10 @@
             <w:r>
               <w:rPr>
                 <w:rFonts w:ascii="Times New Roman" w:hAnsi="Times New Roman"/>
-                <w:sz w:val="20"/>
-              </w:rPr>
-              <w:t>sql/01_schema.sql</w:t>
+                <w:b/>
+                <w:sz w:val="20"/>
+              </w:rPr>
+              <w:t>`ProServ.accdb`</w:t>
             </w:r>
           </w:p>
         </w:tc>
@@ -8879,9 +9341,17 @@
             <w:r>
               <w:rPr>
                 <w:rFonts w:ascii="Times New Roman" w:hAnsi="Times New Roman"/>
-                <w:sz w:val="20"/>
-              </w:rPr>
-              <w:t>definicja struktury czterech tabel, kluczy i relacji (DDL)</w:t>
+                <w:b/>
+                <w:sz w:val="20"/>
+              </w:rPr>
+              <w:t>gotowa baza danych MS Access</w:t>
+            </w:r>
+            <w:r>
+              <w:rPr>
+                <w:rFonts w:ascii="Times New Roman" w:hAnsi="Times New Roman"/>
+                <w:sz w:val="20"/>
+              </w:rPr>
+              <w:t xml:space="preserve"> (4 tabele, relacje, dane)</w:t>
             </w:r>
           </w:p>
         </w:tc>
@@ -8903,7 +9373,7 @@
                 <w:rFonts w:ascii="Times New Roman" w:hAnsi="Times New Roman"/>
                 <w:sz w:val="20"/>
               </w:rPr>
-              <w:t>sql/02_dane.sql</w:t>
+              <w:t>sql/01_schema.sql</w:t>
             </w:r>
           </w:p>
         </w:tc>
@@ -8923,7 +9393,7 @@
                 <w:rFonts w:ascii="Times New Roman" w:hAnsi="Times New Roman"/>
                 <w:sz w:val="20"/>
               </w:rPr>
-              <w:t>przykładowe dane testowe</w:t>
+              <w:t>definicja struktury czterech tabel, kluczy i relacji (DDL)</w:t>
             </w:r>
           </w:p>
         </w:tc>
@@ -8945,7 +9415,7 @@
                 <w:rFonts w:ascii="Times New Roman" w:hAnsi="Times New Roman"/>
                 <w:sz w:val="20"/>
               </w:rPr>
-              <w:t>sql/03_kwerendy.sql</w:t>
+              <w:t>sql/02_dane.sql</w:t>
             </w:r>
           </w:p>
         </w:tc>
@@ -8965,7 +9435,7 @@
                 <w:rFonts w:ascii="Times New Roman" w:hAnsi="Times New Roman"/>
                 <w:sz w:val="20"/>
               </w:rPr>
-              <w:t>cztery kwerendy (2 proste, 2 złożone)</w:t>
+              <w:t>przykładowe dane testowe</w:t>
             </w:r>
           </w:p>
         </w:tc>
@@ -8987,7 +9457,7 @@
                 <w:rFonts w:ascii="Times New Roman" w:hAnsi="Times New Roman"/>
                 <w:sz w:val="20"/>
               </w:rPr>
-              <w:t>build_db.py</w:t>
+              <w:t>sql/03_kwerendy.sql</w:t>
             </w:r>
           </w:p>
         </w:tc>
@@ -9007,7 +9477,7 @@
                 <w:rFonts w:ascii="Times New Roman" w:hAnsi="Times New Roman"/>
                 <w:sz w:val="20"/>
               </w:rPr>
-              <w:t>skrypt budujący i weryfikujący bazę z plików SQL</w:t>
+              <w:t>cztery kwerendy (2 proste, 2 złożone) – wersja ogólna/SQLite</w:t>
             </w:r>
           </w:p>
         </w:tc>
@@ -9029,7 +9499,7 @@
                 <w:rFonts w:ascii="Times New Roman" w:hAnsi="Times New Roman"/>
                 <w:sz w:val="20"/>
               </w:rPr>
-              <w:t>baza_proserv.sqlite</w:t>
+              <w:t>sql/kwerendy_ms_access.sql</w:t>
             </w:r>
           </w:p>
         </w:tc>
@@ -9049,7 +9519,7 @@
                 <w:rFonts w:ascii="Times New Roman" w:hAnsi="Times New Roman"/>
                 <w:sz w:val="20"/>
               </w:rPr>
-              <w:t>gotowa, zbudowana baza danych (do podglądu/weryfikacji)</w:t>
+              <w:t>te same kwerendy w dialekcie MS Access (do wklejenia)</w:t>
             </w:r>
           </w:p>
         </w:tc>
@@ -9071,7 +9541,7 @@
                 <w:rFonts w:ascii="Times New Roman" w:hAnsi="Times New Roman"/>
                 <w:sz w:val="20"/>
               </w:rPr>
-              <w:t>nocode-app/index.html</w:t>
+              <w:t>build_db.py</w:t>
             </w:r>
           </w:p>
         </w:tc>
@@ -9091,7 +9561,91 @@
                 <w:rFonts w:ascii="Times New Roman" w:hAnsi="Times New Roman"/>
                 <w:sz w:val="20"/>
               </w:rPr>
-              <w:t>działająca aplikacja no-code z formularzami</w:t>
+              <w:t>skrypt budujący i weryfikujący bazę z plików SQL</w:t>
+            </w:r>
+          </w:p>
+        </w:tc>
+      </w:tr>
+      <w:tr>
+        <w:tc>
+          <w:tcPr>
+            <w:tcW w:type="dxa" w:w="4703"/>
+          </w:tcPr>
+          <w:p>
+            <w:r>
+              <w:rPr>
+                <w:rFonts w:ascii="Times New Roman" w:hAnsi="Times New Roman"/>
+                <w:sz w:val="20"/>
+              </w:rPr>
+            </w:r>
+            <w:r>
+              <w:rPr>
+                <w:rFonts w:ascii="Times New Roman" w:hAnsi="Times New Roman"/>
+                <w:sz w:val="20"/>
+              </w:rPr>
+              <w:t>baza_proserv.sqlite</w:t>
+            </w:r>
+          </w:p>
+        </w:tc>
+        <w:tc>
+          <w:tcPr>
+            <w:tcW w:type="dxa" w:w="4703"/>
+          </w:tcPr>
+          <w:p>
+            <w:r>
+              <w:rPr>
+                <w:rFonts w:ascii="Times New Roman" w:hAnsi="Times New Roman"/>
+                <w:sz w:val="20"/>
+              </w:rPr>
+            </w:r>
+            <w:r>
+              <w:rPr>
+                <w:rFonts w:ascii="Times New Roman" w:hAnsi="Times New Roman"/>
+                <w:sz w:val="20"/>
+              </w:rPr>
+              <w:t>pomocnicza, zbudowana baza do automatycznej weryfikacji</w:t>
+            </w:r>
+          </w:p>
+        </w:tc>
+      </w:tr>
+      <w:tr>
+        <w:tc>
+          <w:tcPr>
+            <w:tcW w:type="dxa" w:w="4703"/>
+          </w:tcPr>
+          <w:p>
+            <w:r>
+              <w:rPr>
+                <w:rFonts w:ascii="Times New Roman" w:hAnsi="Times New Roman"/>
+                <w:sz w:val="20"/>
+              </w:rPr>
+            </w:r>
+            <w:r>
+              <w:rPr>
+                <w:rFonts w:ascii="Times New Roman" w:hAnsi="Times New Roman"/>
+                <w:sz w:val="20"/>
+              </w:rPr>
+              <w:t>sprawozdanie/instrukcja_nocode.md</w:t>
+            </w:r>
+          </w:p>
+        </w:tc>
+        <w:tc>
+          <w:tcPr>
+            <w:tcW w:type="dxa" w:w="4703"/>
+          </w:tcPr>
+          <w:p>
+            <w:r>
+              <w:rPr>
+                <w:rFonts w:ascii="Times New Roman" w:hAnsi="Times New Roman"/>
+                <w:sz w:val="20"/>
+              </w:rPr>
+            </w:r>
+            <w:r>
+              <w:rPr>
+                <w:rFonts w:ascii="Times New Roman" w:hAnsi="Times New Roman"/>
+                <w:sz w:val="20"/>
+              </w:rPr>
+              <w:t>instrukcja krok po kroku odtworzenia w Knack/Tadabase</w:t>
             </w:r>
           </w:p>
         </w:tc>
@@ -9230,6 +9784,56 @@
           <w:b/>
         </w:rPr>
         <w:t>Sposób weryfikacji projektu:</w:t>
+      </w:r>
+    </w:p>
+    <w:p>
+      <w:pPr>
+        <w:pStyle w:val="ListBullet"/>
+      </w:pPr>
+      <w:r>
+        <w:t xml:space="preserve">Plik </w:t>
+      </w:r>
+      <w:r>
+        <w:rPr>
+          <w:b/>
+        </w:rPr>
+        <w:t>`ProServ.accdb`</w:t>
+      </w:r>
+      <w:r>
+        <w:t xml:space="preserve"> otwiera się bezpośrednio w programie MS Access –</w:t>
+      </w:r>
+    </w:p>
+    <w:p>
+      <w:r>
+        <w:t xml:space="preserve">  zawiera cztery tabele, relacje z wymuszonymi więzami integralności oraz dane.</w:t>
+      </w:r>
+    </w:p>
+    <w:p>
+      <w:r>
+        <w:t xml:space="preserve">  Cztery kwerendy tworzy się, wklejając zapytania z pliku</w:t>
+      </w:r>
+    </w:p>
+    <w:p>
+      <w:r>
+        <w:t xml:space="preserve">  </w:t>
+      </w:r>
+      <w:r>
+        <w:rPr>
+          <w:rFonts w:ascii="Consolas" w:hAnsi="Consolas"/>
+          <w:sz w:val="20"/>
+        </w:rPr>
+        <w:t>sql/kwerendy_ms_access.sql</w:t>
+      </w:r>
+      <w:r>
+        <w:t xml:space="preserve"> (Widok SQL → Uruchom).</w:t>
+      </w:r>
+    </w:p>
+    <w:p>
+      <w:pPr>
+        <w:pStyle w:val="ListBullet"/>
+      </w:pPr>
+      <w:r>
+        <w:t>Niezależną weryfikację poprawności struktury, danych i kwerend zapewnia skrypt:</w:t>
       </w:r>
     </w:p>
     <w:p>
@@ -9247,20 +9851,26 @@
       </w:r>
     </w:p>
     <w:p>
+      <w:pPr>
+        <w:pStyle w:val="ListBullet"/>
+      </w:pPr>
       <w:r>
-        <w:t xml:space="preserve">Aplikację no-code uruchamia się przez otwarcie pliku </w:t>
+        <w:t>Część no-code wykonuje się w Knack.com (lub Tadabase.io) zgodnie z załącznikiem</w:t>
+      </w:r>
+    </w:p>
+    <w:p>
+      <w:r>
+        <w:t xml:space="preserve">  </w:t>
       </w:r>
       <w:r>
         <w:rPr>
           <w:rFonts w:ascii="Consolas" w:hAnsi="Consolas"/>
           <w:sz w:val="20"/>
         </w:rPr>
-        <w:t>nocode-app/index.html</w:t>
+        <w:t>instrukcja_nocode.md</w:t>
       </w:r>
-    </w:p>
-    <w:p>
       <w:r>
-        <w:t>w dowolnej przeglądarce internetowej.</w:t>
+        <w:t>; gotową aplikację dokumentuje się zrzutami ekranu.</w:t>
       </w:r>
     </w:p>
     <w:sectPr>

</xml_diff>

<commit_message>
Dodaj pliki CSV z danymi oraz strone tytulowa sprawozdania
- data/*.csv: dane 4 tabel (UTF-8 BOM) do importu w Knack i MS Access
- data/README.md: instrukcja importu CSV (m.in. mapowanie relacji w Knack)
- generate_csv.py: eksport danych z bazy do CSV
- strona tytulowa w sprawozdaniu.docx z polami do uzupelnienia
  (autor, nr indeksu, grupa, prowadzacy) i numeracja stron od tresci
</commit_message>
<xml_diff>
--- a/sprawozdanie/sprawozdanie.docx
+++ b/sprawozdanie/sprawozdanie.docx
@@ -2,6 +2,191 @@
 <file path=word/document.xml><?xml version="1.0" encoding="utf-8"?>
 <w:document xmlns:wpc="http://schemas.microsoft.com/office/word/2010/wordprocessingCanvas" xmlns:mo="http://schemas.microsoft.com/office/mac/office/2008/main" xmlns:mc="http://schemas.openxmlformats.org/markup-compatibility/2006" xmlns:mv="urn:schemas-microsoft-com:mac:vml" xmlns:o="urn:schemas-microsoft-com:office:office" xmlns:r="http://schemas.openxmlformats.org/officeDocument/2006/relationships" xmlns:m="http://schemas.openxmlformats.org/officeDocument/2006/math" xmlns:v="urn:schemas-microsoft-com:vml" xmlns:wp14="http://schemas.microsoft.com/office/word/2010/wordprocessingDrawing" xmlns:wp="http://schemas.openxmlformats.org/drawingml/2006/wordprocessingDrawing" xmlns:w10="urn:schemas-microsoft-com:office:word" xmlns:w="http://schemas.openxmlformats.org/wordprocessingml/2006/main" xmlns:w14="http://schemas.microsoft.com/office/word/2010/wordml" xmlns:wpg="http://schemas.microsoft.com/office/word/2010/wordprocessingGroup" xmlns:wpi="http://schemas.microsoft.com/office/word/2010/wordprocessingInk" xmlns:wne="http://schemas.microsoft.com/office/word/2006/wordml" xmlns:wps="http://schemas.microsoft.com/office/word/2010/wordprocessingShape" mc:Ignorable="w14 wp14">
   <w:body>
+    <w:p>
+      <w:pPr>
+        <w:spacing w:line="240" w:lineRule="auto" w:before="0" w:after="40"/>
+        <w:jc w:val="center"/>
+      </w:pPr>
+      <w:r>
+        <w:rPr>
+          <w:rFonts w:ascii="Times New Roman" w:hAnsi="Times New Roman"/>
+          <w:b w:val="0"/>
+          <w:i w:val="0"/>
+          <w:sz w:val="24"/>
+        </w:rPr>
+        <w:t>……………………………………………………………</w:t>
+      </w:r>
+    </w:p>
+    <w:p>
+      <w:pPr>
+        <w:spacing w:line="240" w:lineRule="auto" w:before="0" w:after="600"/>
+        <w:jc w:val="center"/>
+      </w:pPr>
+      <w:r>
+        <w:rPr>
+          <w:rFonts w:ascii="Times New Roman" w:hAnsi="Times New Roman"/>
+          <w:b w:val="0"/>
+          <w:i/>
+          <w:sz w:val="20"/>
+        </w:rPr>
+        <w:t>(nazwa uczelni / wydziału)</w:t>
+      </w:r>
+    </w:p>
+    <w:p>
+      <w:pPr>
+        <w:spacing w:line="240" w:lineRule="auto" w:before="0" w:after="40"/>
+        <w:jc w:val="center"/>
+      </w:pPr>
+      <w:r>
+        <w:rPr>
+          <w:rFonts w:ascii="Times New Roman" w:hAnsi="Times New Roman"/>
+          <w:b w:val="0"/>
+          <w:i w:val="0"/>
+          <w:sz w:val="28"/>
+        </w:rPr>
+        <w:t>Informatyka w zarządzaniu</w:t>
+      </w:r>
+    </w:p>
+    <w:p>
+      <w:pPr>
+        <w:spacing w:line="240" w:lineRule="auto" w:before="0" w:after="1400"/>
+        <w:jc w:val="center"/>
+      </w:pPr>
+      <w:r>
+        <w:rPr>
+          <w:rFonts w:ascii="Times New Roman" w:hAnsi="Times New Roman"/>
+          <w:b w:val="0"/>
+          <w:i/>
+          <w:sz w:val="22"/>
+        </w:rPr>
+        <w:t>57 MC – FIR</w:t>
+      </w:r>
+    </w:p>
+    <w:p>
+      <w:pPr>
+        <w:spacing w:line="240" w:lineRule="auto" w:before="0" w:after="200"/>
+        <w:jc w:val="center"/>
+      </w:pPr>
+      <w:r>
+        <w:rPr>
+          <w:rFonts w:ascii="Times New Roman" w:hAnsi="Times New Roman"/>
+          <w:b/>
+          <w:i w:val="0"/>
+          <w:sz w:val="26"/>
+        </w:rPr>
+        <w:t>SPRAWOZDANIE Z PROJEKTU</w:t>
+      </w:r>
+    </w:p>
+    <w:p>
+      <w:pPr>
+        <w:spacing w:line="240" w:lineRule="auto" w:before="0" w:after="1600"/>
+        <w:jc w:val="center"/>
+      </w:pPr>
+      <w:r>
+        <w:rPr>
+          <w:rFonts w:ascii="Times New Roman" w:hAnsi="Times New Roman"/>
+          <w:b/>
+          <w:i w:val="0"/>
+          <w:sz w:val="34"/>
+        </w:rPr>
+        <w:t>Projekt i implementacja relacyjnej bazy danych systemu obsługi zamówień firmy usługowej oraz jej odtworzenie w aplikacji no-code (Knack.com)</w:t>
+      </w:r>
+    </w:p>
+    <w:p>
+      <w:pPr>
+        <w:spacing w:line="240" w:lineRule="auto" w:before="0" w:after="120"/>
+        <w:jc w:val="center"/>
+      </w:pPr>
+      <w:r>
+        <w:rPr>
+          <w:rFonts w:ascii="Times New Roman" w:hAnsi="Times New Roman"/>
+          <w:b w:val="0"/>
+          <w:i w:val="0"/>
+          <w:sz w:val="24"/>
+        </w:rPr>
+        <w:t>Autor: ………………………………………………</w:t>
+      </w:r>
+    </w:p>
+    <w:p>
+      <w:pPr>
+        <w:spacing w:line="240" w:lineRule="auto" w:before="0" w:after="120"/>
+        <w:jc w:val="center"/>
+      </w:pPr>
+      <w:r>
+        <w:rPr>
+          <w:rFonts w:ascii="Times New Roman" w:hAnsi="Times New Roman"/>
+          <w:b w:val="0"/>
+          <w:i w:val="0"/>
+          <w:sz w:val="24"/>
+        </w:rPr>
+        <w:t>Nr indeksu: ……………………        Grupa: ……………………</w:t>
+      </w:r>
+    </w:p>
+    <w:p>
+      <w:pPr>
+        <w:spacing w:line="240" w:lineRule="auto" w:before="0" w:after="800"/>
+        <w:jc w:val="center"/>
+      </w:pPr>
+      <w:r>
+        <w:rPr>
+          <w:rFonts w:ascii="Times New Roman" w:hAnsi="Times New Roman"/>
+          <w:b w:val="0"/>
+          <w:i w:val="0"/>
+          <w:sz w:val="24"/>
+        </w:rPr>
+        <w:t>Kierunek / tryb studiów: ………………………………</w:t>
+      </w:r>
+    </w:p>
+    <w:p>
+      <w:pPr>
+        <w:spacing w:line="240" w:lineRule="auto" w:before="0" w:after="1600"/>
+        <w:jc w:val="center"/>
+      </w:pPr>
+      <w:r>
+        <w:rPr>
+          <w:rFonts w:ascii="Times New Roman" w:hAnsi="Times New Roman"/>
+          <w:b w:val="0"/>
+          <w:i w:val="0"/>
+          <w:sz w:val="24"/>
+        </w:rPr>
+        <w:t>Prowadzący: ………………………………………………</w:t>
+      </w:r>
+    </w:p>
+    <w:p>
+      <w:pPr>
+        <w:spacing w:line="240" w:lineRule="auto" w:before="0" w:after="40"/>
+        <w:jc w:val="center"/>
+      </w:pPr>
+      <w:r>
+        <w:rPr>
+          <w:rFonts w:ascii="Times New Roman" w:hAnsi="Times New Roman"/>
+          <w:b w:val="0"/>
+          <w:i w:val="0"/>
+          <w:sz w:val="24"/>
+        </w:rPr>
+        <w:t>………………………………, rok akademicki 2025/2026</w:t>
+      </w:r>
+    </w:p>
+    <w:p>
+      <w:pPr>
+        <w:spacing w:line="240" w:lineRule="auto" w:before="0" w:after="0"/>
+        <w:jc w:val="center"/>
+      </w:pPr>
+      <w:r>
+        <w:rPr>
+          <w:rFonts w:ascii="Times New Roman" w:hAnsi="Times New Roman"/>
+          <w:b w:val="0"/>
+          <w:i/>
+          <w:sz w:val="20"/>
+        </w:rPr>
+        <w:t>(miejscowość)</w:t>
+      </w:r>
+    </w:p>
+    <w:p>
+      <w:r>
+        <w:br w:type="page"/>
+      </w:r>
+    </w:p>
     <w:p>
       <w:pPr>
         <w:pStyle w:val="Heading1"/>
@@ -9541,6 +9726,48 @@
                 <w:rFonts w:ascii="Times New Roman" w:hAnsi="Times New Roman"/>
                 <w:sz w:val="20"/>
               </w:rPr>
+              <w:t>data/*.csv</w:t>
+            </w:r>
+          </w:p>
+        </w:tc>
+        <w:tc>
+          <w:tcPr>
+            <w:tcW w:type="dxa" w:w="4703"/>
+          </w:tcPr>
+          <w:p>
+            <w:r>
+              <w:rPr>
+                <w:rFonts w:ascii="Times New Roman" w:hAnsi="Times New Roman"/>
+                <w:sz w:val="20"/>
+              </w:rPr>
+            </w:r>
+            <w:r>
+              <w:rPr>
+                <w:rFonts w:ascii="Times New Roman" w:hAnsi="Times New Roman"/>
+                <w:sz w:val="20"/>
+              </w:rPr>
+              <w:t>dane czterech tabel w formacie CSV (import do Access/Knack)</w:t>
+            </w:r>
+          </w:p>
+        </w:tc>
+      </w:tr>
+      <w:tr>
+        <w:tc>
+          <w:tcPr>
+            <w:tcW w:type="dxa" w:w="4703"/>
+          </w:tcPr>
+          <w:p>
+            <w:r>
+              <w:rPr>
+                <w:rFonts w:ascii="Times New Roman" w:hAnsi="Times New Roman"/>
+                <w:sz w:val="20"/>
+              </w:rPr>
+            </w:r>
+            <w:r>
+              <w:rPr>
+                <w:rFonts w:ascii="Times New Roman" w:hAnsi="Times New Roman"/>
+                <w:sz w:val="20"/>
+              </w:rPr>
               <w:t>build_db.py</w:t>
             </w:r>
           </w:p>
@@ -9562,6 +9789,48 @@
                 <w:sz w:val="20"/>
               </w:rPr>
               <w:t>skrypt budujący i weryfikujący bazę z plików SQL</w:t>
+            </w:r>
+          </w:p>
+        </w:tc>
+      </w:tr>
+      <w:tr>
+        <w:tc>
+          <w:tcPr>
+            <w:tcW w:type="dxa" w:w="4703"/>
+          </w:tcPr>
+          <w:p>
+            <w:r>
+              <w:rPr>
+                <w:rFonts w:ascii="Times New Roman" w:hAnsi="Times New Roman"/>
+                <w:sz w:val="20"/>
+              </w:rPr>
+            </w:r>
+            <w:r>
+              <w:rPr>
+                <w:rFonts w:ascii="Times New Roman" w:hAnsi="Times New Roman"/>
+                <w:sz w:val="20"/>
+              </w:rPr>
+              <w:t>generate_csv.py</w:t>
+            </w:r>
+          </w:p>
+        </w:tc>
+        <w:tc>
+          <w:tcPr>
+            <w:tcW w:type="dxa" w:w="4703"/>
+          </w:tcPr>
+          <w:p>
+            <w:r>
+              <w:rPr>
+                <w:rFonts w:ascii="Times New Roman" w:hAnsi="Times New Roman"/>
+                <w:sz w:val="20"/>
+              </w:rPr>
+            </w:r>
+            <w:r>
+              <w:rPr>
+                <w:rFonts w:ascii="Times New Roman" w:hAnsi="Times New Roman"/>
+                <w:sz w:val="20"/>
+              </w:rPr>
+              <w:t>eksport danych do plików CSV</w:t>
             </w:r>
           </w:p>
         </w:tc>
@@ -9878,6 +10147,7 @@
       <w:pgSz w:w="12240" w:h="15840"/>
       <w:pgMar w:top="1417" w:right="1417" w:bottom="1417" w:left="1417" w:header="720" w:footer="720" w:gutter="0"/>
       <w:cols w:space="720"/>
+      <w:titlePg/>
       <w:docGrid w:linePitch="360"/>
     </w:sectPr>
   </w:body>

</xml_diff>

<commit_message>
Dodaj miejsca na zrzuty ekranu z Knack.com oraz szacowany czas realizacji
- 7 ramek na zrzuty (Rys. 1-7) w sekcjach 6-7 sprawozdania (tylko Knack)
- czesc MS Access udokumentowana opisowo (bez zrzutow - dolaczony .accdb)
- szacowany czas odtworzenia w Knack.com (~60-90 min) w raporcie i instrukcji
- generator docx obsluguje znacznik [[SCREENSHOT: podpis]]
</commit_message>
<xml_diff>
--- a/sprawozdanie/sprawozdanie.docx
+++ b/sprawozdanie/sprawozdanie.docx
@@ -829,6 +829,52 @@
       </w:r>
     </w:p>
     <w:p>
+      <w:pPr>
+        <w:ind w:left="454"/>
+      </w:pPr>
+      <w:r>
+        <w:rPr>
+          <w:i/>
+        </w:rPr>
+        <w:t xml:space="preserve">Gotowa baza znajduje się w dołączonym pliku </w:t>
+      </w:r>
+      <w:r>
+        <w:rPr>
+          <w:b/>
+          <w:i/>
+        </w:rPr>
+        <w:t>`ProServ.accdb`</w:t>
+      </w:r>
+      <w:r>
+        <w:rPr>
+          <w:i/>
+        </w:rPr>
+        <w:t>, dlatego część</w:t>
+      </w:r>
+    </w:p>
+    <w:p>
+      <w:pPr>
+        <w:ind w:left="454"/>
+      </w:pPr>
+      <w:r>
+        <w:rPr>
+          <w:i/>
+        </w:rPr>
+        <w:t>dotyczącą MS Access udokumentowano opisowo (bez zrzutów ekranu) – strukturę,</w:t>
+      </w:r>
+    </w:p>
+    <w:p>
+      <w:pPr>
+        <w:ind w:left="454"/>
+      </w:pPr>
+      <w:r>
+        <w:rPr>
+          <w:i/>
+        </w:rPr>
+        <w:t>relacje, dane i kwerendy można sprawdzić bezpośrednio w tym pliku.</w:t>
+      </w:r>
+    </w:p>
+    <w:p>
       <w:r>
         <w:t>Poniżej przedstawiono strukturę każdej z czterech tabel wraz z typami danych</w:t>
       </w:r>
@@ -7748,6 +7794,20 @@
         <w:t>`instrukcja_nocode.md`</w:t>
       </w:r>
       <w:r>
+        <w:t>. Szacowany czas</w:t>
+      </w:r>
+    </w:p>
+    <w:p>
+      <w:r>
+        <w:t xml:space="preserve">odtworzenia całości w Knack.com to około </w:t>
+      </w:r>
+      <w:r>
+        <w:rPr>
+          <w:b/>
+        </w:rPr>
+        <w:t>60–90 minut</w:t>
+      </w:r>
+      <w:r>
         <w:t>.</w:t>
       </w:r>
     </w:p>
@@ -8822,21 +8882,254 @@
     </w:p>
     <w:p>
       <w:r>
-        <w:t>Access. Zrzuty ekranu z gotowej aplikacji (rysunki 1–7 wg listy w</w:t>
+        <w:t>Access. Poniższe zrzuty ekranu dokumentują kolejne etapy pracy w Knack.com.</w:t>
       </w:r>
     </w:p>
+    <w:tbl>
+      <w:tblPr>
+        <w:tblStyle w:val="TableGrid"/>
+        <w:tblW w:type="auto" w:w="0"/>
+        <w:jc w:val="center"/>
+        <w:tblLook w:firstColumn="1" w:firstRow="1" w:lastColumn="0" w:lastRow="0" w:noHBand="0" w:noVBand="1" w:val="04A0"/>
+      </w:tblPr>
+      <w:tblGrid>
+        <w:gridCol w:w="9406"/>
+      </w:tblGrid>
+      <w:tr>
+        <w:trPr>
+          <w:trHeight w:val="3969" w:hRule="atLeast"/>
+        </w:trPr>
+        <w:tc>
+          <w:tcPr>
+            <w:tcW w:type="dxa" w:w="9406"/>
+            <w:shd w:val="clear" w:fill="F2F2F2"/>
+          </w:tcPr>
+          <w:p>
+            <w:pPr>
+              <w:jc w:val="center"/>
+            </w:pPr>
+            <w:r>
+              <w:rPr>
+                <w:i/>
+                <w:color w:val="9A9A9A"/>
+                <w:sz w:val="20"/>
+              </w:rPr>
+              <w:t>[ miejsce na zrzut ekranu – wklej tutaj obraz ]</w:t>
+            </w:r>
+          </w:p>
+        </w:tc>
+      </w:tr>
+    </w:tbl>
     <w:p>
+      <w:pPr>
+        <w:spacing w:before="40"/>
+        <w:jc w:val="center"/>
+      </w:pPr>
       <w:r>
         <w:rPr>
-          <w:rFonts w:ascii="Consolas" w:hAnsi="Consolas"/>
+          <w:i/>
           <w:sz w:val="20"/>
         </w:rPr>
-        <w:t>instrukcja_nocode.md</w:t>
-      </w:r>
-      <w:r>
-        <w:t>) dokumentują strukturę, relacje, dane i formularze.</w:t>
+        <w:t>Rys. 1 – Środowisko Builder po utworzeniu aplikacji ProServ w Knack.com</w:t>
       </w:r>
     </w:p>
+    <w:p/>
+    <w:tbl>
+      <w:tblPr>
+        <w:tblStyle w:val="TableGrid"/>
+        <w:tblW w:type="auto" w:w="0"/>
+        <w:jc w:val="center"/>
+        <w:tblLook w:firstColumn="1" w:firstRow="1" w:lastColumn="0" w:lastRow="0" w:noHBand="0" w:noVBand="1" w:val="04A0"/>
+      </w:tblPr>
+      <w:tblGrid>
+        <w:gridCol w:w="9406"/>
+      </w:tblGrid>
+      <w:tr>
+        <w:trPr>
+          <w:trHeight w:val="3969" w:hRule="atLeast"/>
+        </w:trPr>
+        <w:tc>
+          <w:tcPr>
+            <w:tcW w:type="dxa" w:w="9406"/>
+            <w:shd w:val="clear" w:fill="F2F2F2"/>
+          </w:tcPr>
+          <w:p>
+            <w:pPr>
+              <w:jc w:val="center"/>
+            </w:pPr>
+            <w:r>
+              <w:rPr>
+                <w:i/>
+                <w:color w:val="9A9A9A"/>
+                <w:sz w:val="20"/>
+              </w:rPr>
+              <w:t>[ miejsce na zrzut ekranu – wklej tutaj obraz ]</w:t>
+            </w:r>
+          </w:p>
+        </w:tc>
+      </w:tr>
+    </w:tbl>
+    <w:p>
+      <w:pPr>
+        <w:spacing w:before="40"/>
+        <w:jc w:val="center"/>
+      </w:pPr>
+      <w:r>
+        <w:rPr>
+          <w:i/>
+          <w:sz w:val="20"/>
+        </w:rPr>
+        <w:t>Rys. 2 – Lista pól obiektu Klient (oraz Usluga) odwzorowująca strukturę tabel z MS Access</w:t>
+      </w:r>
+    </w:p>
+    <w:p/>
+    <w:tbl>
+      <w:tblPr>
+        <w:tblStyle w:val="TableGrid"/>
+        <w:tblW w:type="auto" w:w="0"/>
+        <w:jc w:val="center"/>
+        <w:tblLook w:firstColumn="1" w:firstRow="1" w:lastColumn="0" w:lastRow="0" w:noHBand="0" w:noVBand="1" w:val="04A0"/>
+      </w:tblPr>
+      <w:tblGrid>
+        <w:gridCol w:w="9406"/>
+      </w:tblGrid>
+      <w:tr>
+        <w:trPr>
+          <w:trHeight w:val="3969" w:hRule="atLeast"/>
+        </w:trPr>
+        <w:tc>
+          <w:tcPr>
+            <w:tcW w:type="dxa" w:w="9406"/>
+            <w:shd w:val="clear" w:fill="F2F2F2"/>
+          </w:tcPr>
+          <w:p>
+            <w:pPr>
+              <w:jc w:val="center"/>
+            </w:pPr>
+            <w:r>
+              <w:rPr>
+                <w:i/>
+                <w:color w:val="9A9A9A"/>
+                <w:sz w:val="20"/>
+              </w:rPr>
+              <w:t>[ miejsce na zrzut ekranu – wklej tutaj obraz ]</w:t>
+            </w:r>
+          </w:p>
+        </w:tc>
+      </w:tr>
+    </w:tbl>
+    <w:p>
+      <w:pPr>
+        <w:spacing w:before="40"/>
+        <w:jc w:val="center"/>
+      </w:pPr>
+      <w:r>
+        <w:rPr>
+          <w:i/>
+          <w:sz w:val="20"/>
+        </w:rPr>
+        <w:t>Rys. 3 – Tworzenie relacji za pomocą pola Connection (Zamowienie → Klient)</w:t>
+      </w:r>
+    </w:p>
+    <w:p/>
+    <w:tbl>
+      <w:tblPr>
+        <w:tblStyle w:val="TableGrid"/>
+        <w:tblW w:type="auto" w:w="0"/>
+        <w:jc w:val="center"/>
+        <w:tblLook w:firstColumn="1" w:firstRow="1" w:lastColumn="0" w:lastRow="0" w:noHBand="0" w:noVBand="1" w:val="04A0"/>
+      </w:tblPr>
+      <w:tblGrid>
+        <w:gridCol w:w="9406"/>
+      </w:tblGrid>
+      <w:tr>
+        <w:trPr>
+          <w:trHeight w:val="3969" w:hRule="atLeast"/>
+        </w:trPr>
+        <w:tc>
+          <w:tcPr>
+            <w:tcW w:type="dxa" w:w="9406"/>
+            <w:shd w:val="clear" w:fill="F2F2F2"/>
+          </w:tcPr>
+          <w:p>
+            <w:pPr>
+              <w:jc w:val="center"/>
+            </w:pPr>
+            <w:r>
+              <w:rPr>
+                <w:i/>
+                <w:color w:val="9A9A9A"/>
+                <w:sz w:val="20"/>
+              </w:rPr>
+              <w:t>[ miejsce na zrzut ekranu – wklej tutaj obraz ]</w:t>
+            </w:r>
+          </w:p>
+        </w:tc>
+      </w:tr>
+    </w:tbl>
+    <w:p>
+      <w:pPr>
+        <w:spacing w:before="40"/>
+        <w:jc w:val="center"/>
+      </w:pPr>
+      <w:r>
+        <w:rPr>
+          <w:i/>
+          <w:sz w:val="20"/>
+        </w:rPr>
+        <w:t>Rys. 4 – Konfiguracja pola obliczeniowego Sum (wartość zamówienia)</w:t>
+      </w:r>
+    </w:p>
+    <w:p/>
+    <w:tbl>
+      <w:tblPr>
+        <w:tblStyle w:val="TableGrid"/>
+        <w:tblW w:type="auto" w:w="0"/>
+        <w:jc w:val="center"/>
+        <w:tblLook w:firstColumn="1" w:firstRow="1" w:lastColumn="0" w:lastRow="0" w:noHBand="0" w:noVBand="1" w:val="04A0"/>
+      </w:tblPr>
+      <w:tblGrid>
+        <w:gridCol w:w="9406"/>
+      </w:tblGrid>
+      <w:tr>
+        <w:trPr>
+          <w:trHeight w:val="3969" w:hRule="atLeast"/>
+        </w:trPr>
+        <w:tc>
+          <w:tcPr>
+            <w:tcW w:type="dxa" w:w="9406"/>
+            <w:shd w:val="clear" w:fill="F2F2F2"/>
+          </w:tcPr>
+          <w:p>
+            <w:pPr>
+              <w:jc w:val="center"/>
+            </w:pPr>
+            <w:r>
+              <w:rPr>
+                <w:i/>
+                <w:color w:val="9A9A9A"/>
+                <w:sz w:val="20"/>
+              </w:rPr>
+              <w:t>[ miejsce na zrzut ekranu – wklej tutaj obraz ]</w:t>
+            </w:r>
+          </w:p>
+        </w:tc>
+      </w:tr>
+    </w:tbl>
+    <w:p>
+      <w:pPr>
+        <w:spacing w:before="40"/>
+        <w:jc w:val="center"/>
+      </w:pPr>
+      <w:r>
+        <w:rPr>
+          <w:i/>
+          <w:sz w:val="20"/>
+        </w:rPr>
+        <w:t>Rys. 5 – Tabela Zamowienie z zaimportowanymi danymi i kolumną wartości</w:t>
+      </w:r>
+    </w:p>
+    <w:p/>
     <w:p>
       <w:pPr>
         <w:pStyle w:val="Heading2"/>
@@ -9298,6 +9591,104 @@
         <w:t xml:space="preserve">  są automatycznie.</w:t>
       </w:r>
     </w:p>
+    <w:tbl>
+      <w:tblPr>
+        <w:tblStyle w:val="TableGrid"/>
+        <w:tblW w:type="auto" w:w="0"/>
+        <w:jc w:val="center"/>
+        <w:tblLook w:firstColumn="1" w:firstRow="1" w:lastColumn="0" w:lastRow="0" w:noHBand="0" w:noVBand="1" w:val="04A0"/>
+      </w:tblPr>
+      <w:tblGrid>
+        <w:gridCol w:w="9406"/>
+      </w:tblGrid>
+      <w:tr>
+        <w:trPr>
+          <w:trHeight w:val="3969" w:hRule="atLeast"/>
+        </w:trPr>
+        <w:tc>
+          <w:tcPr>
+            <w:tcW w:type="dxa" w:w="9406"/>
+            <w:shd w:val="clear" w:fill="F2F2F2"/>
+          </w:tcPr>
+          <w:p>
+            <w:pPr>
+              <w:jc w:val="center"/>
+            </w:pPr>
+            <w:r>
+              <w:rPr>
+                <w:i/>
+                <w:color w:val="9A9A9A"/>
+                <w:sz w:val="20"/>
+              </w:rPr>
+              <w:t>[ miejsce na zrzut ekranu – wklej tutaj obraz ]</w:t>
+            </w:r>
+          </w:p>
+        </w:tc>
+      </w:tr>
+    </w:tbl>
+    <w:p>
+      <w:pPr>
+        <w:spacing w:before="40"/>
+        <w:jc w:val="center"/>
+      </w:pPr>
+      <w:r>
+        <w:rPr>
+          <w:i/>
+          <w:sz w:val="20"/>
+        </w:rPr>
+        <w:t>Rys. 6 – Formularz dodawania/edycji zamówienia z listą wyboru klienta i pozycjami</w:t>
+      </w:r>
+    </w:p>
+    <w:p/>
+    <w:tbl>
+      <w:tblPr>
+        <w:tblStyle w:val="TableGrid"/>
+        <w:tblW w:type="auto" w:w="0"/>
+        <w:jc w:val="center"/>
+        <w:tblLook w:firstColumn="1" w:firstRow="1" w:lastColumn="0" w:lastRow="0" w:noHBand="0" w:noVBand="1" w:val="04A0"/>
+      </w:tblPr>
+      <w:tblGrid>
+        <w:gridCol w:w="9406"/>
+      </w:tblGrid>
+      <w:tr>
+        <w:trPr>
+          <w:trHeight w:val="3969" w:hRule="atLeast"/>
+        </w:trPr>
+        <w:tc>
+          <w:tcPr>
+            <w:tcW w:type="dxa" w:w="9406"/>
+            <w:shd w:val="clear" w:fill="F2F2F2"/>
+          </w:tcPr>
+          <w:p>
+            <w:pPr>
+              <w:jc w:val="center"/>
+            </w:pPr>
+            <w:r>
+              <w:rPr>
+                <w:i/>
+                <w:color w:val="9A9A9A"/>
+                <w:sz w:val="20"/>
+              </w:rPr>
+              <w:t>[ miejsce na zrzut ekranu – wklej tutaj obraz ]</w:t>
+            </w:r>
+          </w:p>
+        </w:tc>
+      </w:tr>
+    </w:tbl>
+    <w:p>
+      <w:pPr>
+        <w:spacing w:before="40"/>
+        <w:jc w:val="center"/>
+      </w:pPr>
+      <w:r>
+        <w:rPr>
+          <w:i/>
+          <w:sz w:val="20"/>
+        </w:rPr>
+        <w:t>Rys. 7 – Działająca aplikacja w widoku użytkownika (Live App)</w:t>
+      </w:r>
+    </w:p>
+    <w:p/>
     <w:p>
       <w:pPr>
         <w:pStyle w:val="Heading2"/>

</xml_diff>